<commit_message>
docs: fix spelling error
</commit_message>
<xml_diff>
--- a/Documentation.docx
+++ b/Documentation.docx
@@ -12,19 +12,7 @@
         <w:rPr>
           <w:u w:val="single"/>
         </w:rPr>
-        <w:t>Documentat</w:t>
-      </w:r>
-      <w:r>
-        <w:rPr>
-          <w:u w:val="single"/>
-        </w:rPr>
-        <w:t>i</w:t>
-      </w:r>
-      <w:r>
-        <w:rPr>
-          <w:u w:val="single"/>
-        </w:rPr>
-        <w:t>ion</w:t>
+        <w:t>Documentation</w:t>
       </w:r>
     </w:p>
     <w:sectPr>

</xml_diff>